<commit_message>
docs: add MP cross-check to Track A trio draft, not final
</commit_message>
<xml_diff>
--- a/submissions/track_a/材料证据链_算法赛初赛方案.docx
+++ b/submissions/track_a/材料证据链_算法赛初赛方案.docx
@@ -180,7 +180,7 @@
     <w:p>
       <w:pPr/>
       <w:r>
-        <w:t>本项目聚焦超导材料文献中分散、异构且难以直接迁移的组成—结构—性能关系。系统以可审计工作流编排检索、抽取、构图、关系比较、类比迁移、候选筛选和证据报告：规则程序负责组成解析、关系枚举、去重、退化检测和引用留痕，LLM只在候选排序与搜索扩张两个受约束决策点工作。团队自研L1—L4算法、核心证据底账和Agent四端口；外部使用Sciverse、MatKG、Gemini及React/Electron/Vite前端并明确披露边界。当前已完成工程可行性验证；6条输出仍是待验证候选假设。因本机未配置Materials Project密钥，第四章的Gap交叉验证部分为初步可行性验证方案，不含虚构结果。</w:t>
+        <w:t>本项目聚焦超导材料文献中分散、异构且难以直接迁移的组成—结构—性能关系。系统以可审计工作流编排检索、抽取、构图、关系比较、类比迁移、候选筛选和证据报告：规则程序负责组成解析、关系枚举、去重、退化检测和引用留痕，LLM只在候选排序与搜索扩张两个受约束决策点工作。团队自研L1—L4算法、核心证据底账和Agent四端口；外部使用Sciverse、MatKG、Gemini及React/Electron/Vite前端并明确披露边界。当前已完成工程可行性验证和Materials Project单库初步排重：4条有效组成完成真实查询且无精确匹配，2条因负计量数无法查询。6条仍是待验证候选假设，不宣称新材料或已确认Research Gap。</w:t>
       </w:r>
     </w:p>
     <w:p>
@@ -666,7 +666,7 @@
           </w:tcPr>
           <w:p>
             <w:r>
-              <w:t>本轮无key未执行</w:t>
+              <w:t>x-api-key运行时认证</w:t>
             </w:r>
           </w:p>
         </w:tc>
@@ -676,7 +676,7 @@
           </w:tcPr>
           <w:p>
             <w:r>
-              <w:t>待后续补跑</w:t>
+              <w:t>4条查询完成，2条无效组成未查询</w:t>
             </w:r>
           </w:p>
         </w:tc>
@@ -811,13 +811,13 @@
     <w:p>
       <w:pPr/>
       <w:r>
-        <w:t>本章同时区分已完成工程验证与未完成科学验证，不虚构数据。已完成验证包括：Sciverse检索扩库、核心/扩展证据隔离、四家族搜索回归、候选池跨轮增长、LLM审计和17项自动化测试。未完成项是6条候选的Materials Project/OQMD/NOMAD交叉验证与实验验证。</w:t>
+        <w:t>本章同时区分已完成工程验证与未完成科学验证，不虚构数据。已完成验证包括：Sciverse检索扩库、核心/扩展证据隔离、四家族搜索回归、候选池跨轮增长、LLM审计、20项自动化测试和Materials Project单库初步排重。尚未完成OQMD/NOMAD、文献排重、领域签审与实验验证。</w:t>
       </w:r>
     </w:p>
     <w:p>
       <w:pPr/>
       <w:r>
-        <w:t>Materials Project初步可行性验证方案为：解析target_base并叠加predicted_composition_delta；对含x、加号或混相符号的表达式先人工规范化；使用Bearer认证按归一化组成查询；保存时间、查询式、返回材料ID、匹配标准和响应摘要。查到时标“已知材料，非Gap”；未查到时仅标“该库当前查询未见匹配”，再到OQMD、NOMAD和文献库复核。计划构建6条候选的人工签审表，以数据库覆盖、组成可解析性、证据完整性和可证伪性为指标；数据库未完成前不报告Gap准确率。</w:t>
+        <w:t>Materials Project真实交叉验证由src/mp_crosscheck.py执行：从私密配置读取密钥，使用官方客户端当前采用的x-api-key请求头；将target_base归一化组成叠加predicted_composition_delta，负计量数直接拒绝；按精确化学体系拉取记录，再以元素分数绝对误差0.001匹配。6条中4条完成查询且无精确匹配：Fe-S-Te体系的2条Fe4Te3S及As-Ce-F-Fe-O体系的1条Ce8Fe8As8O7F均与候选组成不同，另外两个体系无记录；2条因负计量数无法形成有效化学式。变量x沿用雏形约定取0.5，复合添加暂按单一组成近似。结果见outputs/mp_crosscheck.json；单库未命中仍需OQMD、NOMAD、文献与实验复核。</w:t>
       </w:r>
     </w:p>
     <w:p>
@@ -831,7 +831,7 @@
     <w:p>
       <w:pPr/>
       <w:r>
-        <w:t>① 证据底账：81条核心边、53个唯一DOI、94个核心材料，见knowledge/edges.csv和outputs/pipeline_report.json。② 弱证据扩展：MatKG经流式双层过滤获得210条边，见knowledge/edges_matkg.csv和matkg_import_report.json。③ 规则验证：438次同类比较中记录326组非退化证据。④ 候选输出：6条均标“候选假设（未验证）”，见L4_application.candidates。⑤ 搜索验证：122、1111、11、MgB2四家族验收PASS，候选池分别33→52、56→96、56→96、44→76。⑥ 工程验证：17/17测试通过。⑦ LLM底账：160次逻辑决策中39次真实Gemini成功，其余诚实降级，见outputs/llm_calls；调用成功不代表科学假设成立。⑧ Gap状态：本机无MP_API_KEY，未生成mp_crosscheck.json，不能写成已完成Gap识别。</w:t>
+        <w:t>① 证据底账：81条核心边、53个唯一DOI、94个核心材料，见knowledge/edges.csv和outputs/pipeline_report.json。② 弱证据扩展：MatKG经流式双层过滤获得210条边，见knowledge/edges_matkg.csv和matkg_import_report.json。③ 规则验证：438次同类比较中记录326组非退化证据。④ 候选输出：6条均标“候选假设（未验证）”，见L4_application.candidates。⑤ 搜索验证：122、1111、11、MgB2四家族验收PASS，候选池分别33→52、56→96、56→96、44→76。⑥ 工程验证：20/20测试通过。⑦ LLM底账：160次逻辑决策中39次真实Gemini成功，其余诚实降级；调用成功不代表科学假设成立。⑧ MP排重：4条有效组成真实查询、0条精确匹配，2条负计量数组成未查询；因此仍不能写成已完成Gap识别。</w:t>
       </w:r>
     </w:p>
     <w:p>
@@ -1017,7 +1017,7 @@
     <w:p>
       <w:pPr/>
       <w:r>
-        <w:t>1. Materials Project API key及6条候选的实际交叉验证结果。</w:t>
+        <w:t>1. 修正2条负计量数组成，并对变量/多相候选做材料专家规范化。</w:t>
       </w:r>
     </w:p>
     <w:p>

</xml_diff>

<commit_message>
docs: remove placeholder brackets from Track A team sections, regenerate docx/zip
</commit_message>
<xml_diff>
--- a/submissions/track_a/材料证据链_算法赛初赛方案.docx
+++ b/submissions/track_a/材料证据链_算法赛初赛方案.docx
@@ -966,7 +966,7 @@
     <w:p>
       <w:pPr/>
       <w:r>
-        <w:t>吕志远：总体架构、证据链、Track A算法实现与提交审查；林夏槿：负责Skill工程实现（sciverse-search/evidence-ledger）与Docker一键复现打包；谭力奎：多Agent协作架构、React/Electron/Vite桌面端、harness测试与新颖性复核。领域签审人【待补充】。</w:t>
+        <w:t>吕志远：总体架构、证据链、Track A算法实现与提交审查；林夏槿：负责Skill工程实现（sciverse-search/evidence-ledger）与Docker一键复现打包；谭力奎：多Agent协作架构、React/Electron/Vite桌面端、harness测试与新颖性复核。领域签审：本轮暂无外部材料学专家签审，留待后续实验阶段引入。</w:t>
       </w:r>
     </w:p>
     <w:p>
@@ -997,7 +997,7 @@
     <w:p>
       <w:pPr/>
       <w:r>
-        <w:t>吕志远：AutoScience研究方向、Claude Science绿皮书/CSA开源生态、hhu-social全链路智能体项目；谭力奎：AI天文望远镜自动化工作流与多望远镜智能体协作架构设计。团队作品公开链接【待补充】。为保护未成年人隐私，本稿不写林夏槿的学校等可识别身份信息。</w:t>
+        <w:t>吕志远：AutoScience研究方向、Claude Science绿皮书/CSA开源生态、hhu-social全链路智能体项目；谭力奎：AI天文望远镜自动化工作流与多望远镜智能体协作架构设计。团队作品公开链接暂不在本次提交中列出。为保护未成年人隐私，本稿不写林夏槿的学校等可识别身份信息。</w:t>
       </w:r>
     </w:p>
     <w:p>
@@ -1029,7 +1029,7 @@
     <w:p>
       <w:pPr/>
       <w:r>
-        <w:t>3. 领域签审人、团队作品公开链接及队友最终公开授权。</w:t>
+        <w:t>3. 引入外部材料学专家领域签审，并取得队友最终公开授权后补充团队作品公开链接。</w:t>
       </w:r>
     </w:p>
     <w:p>

</xml_diff>